<commit_message>
Logger for DistanceCalc + Tests
</commit_message>
<xml_diff>
--- a/documentation/Architecture.docx
+++ b/documentation/Architecture.docx
@@ -72,7 +72,6 @@
       </w:r>
       <w:r>
         <w:rPr>
-          <w:highlight w:val="none"/>
           <w:lang w:val="ru-RU"/>
         </w:rPr>
       </w:r>
@@ -103,6 +102,7 @@
       </w:r>
       <w:r>
         <w:rPr>
+          <w:highlight w:val="none"/>
           <w:lang w:val="ru-RU"/>
         </w:rPr>
       </w:r>
@@ -251,7 +251,6 @@
       </w:r>
       <w:r>
         <w:rPr>
-          <w:highlight w:val="none"/>
           <w:lang w:val="ru-RU"/>
         </w:rPr>
       </w:r>
@@ -309,7 +308,6 @@
       </w:r>
       <w:r>
         <w:rPr>
-          <w:highlight w:val="none"/>
           <w:lang w:val="ru-RU"/>
         </w:rPr>
       </w:r>
@@ -339,7 +337,6 @@
       </w:r>
       <w:r>
         <w:rPr>
-          <w:highlight w:val="none"/>
           <w:lang w:val="ru-RU"/>
         </w:rPr>
       </w:r>
@@ -369,7 +366,6 @@
       </w:r>
       <w:r>
         <w:rPr>
-          <w:highlight w:val="none"/>
           <w:lang w:val="ru-RU"/>
         </w:rPr>
       </w:r>
@@ -399,7 +395,6 @@
       </w:r>
       <w:r>
         <w:rPr>
-          <w:highlight w:val="none"/>
           <w:lang w:val="ru-RU"/>
         </w:rPr>
       </w:r>
@@ -429,7 +424,6 @@
       </w:r>
       <w:r>
         <w:rPr>
-          <w:highlight w:val="none"/>
           <w:lang w:val="ru-RU"/>
         </w:rPr>
       </w:r>
@@ -484,7 +478,6 @@
       </w:r>
       <w:r>
         <w:rPr>
-          <w:highlight w:val="none"/>
           <w:lang w:val="ru-RU"/>
         </w:rPr>
       </w:r>
@@ -514,7 +507,6 @@
       </w:r>
       <w:r>
         <w:rPr>
-          <w:highlight w:val="none"/>
           <w:lang w:val="ru-RU"/>
         </w:rPr>
       </w:r>
@@ -545,6 +537,7 @@
       </w:r>
       <w:r>
         <w:rPr>
+          <w:highlight w:val="none"/>
           <w:lang w:val="ru-RU"/>
         </w:rPr>
       </w:r>
@@ -624,7 +617,6 @@
       </w:r>
       <w:r>
         <w:rPr>
-          <w:highlight w:val="none"/>
           <w:lang w:val="ru-RU"/>
         </w:rPr>
       </w:r>
@@ -745,7 +737,6 @@
       </w:r>
       <w:r>
         <w:rPr>
-          <w:highlight w:val="none"/>
           <w:lang w:val="ru-RU"/>
         </w:rPr>
       </w:r>
@@ -790,6 +781,7 @@
       </w:r>
       <w:r>
         <w:rPr>
+          <w:highlight w:val="none"/>
           <w:lang w:val="ru-RU"/>
         </w:rPr>
       </w:r>
@@ -876,6 +868,7 @@
       </w:r>
       <w:r>
         <w:rPr>
+          <w:highlight w:val="none"/>
           <w:lang w:val="ru-RU"/>
         </w:rPr>
       </w:r>
@@ -969,7 +962,6 @@
       </w:r>
       <w:r>
         <w:rPr>
-          <w:highlight w:val="none"/>
           <w:lang w:val="ru-RU"/>
         </w:rPr>
       </w:r>
@@ -999,7 +991,6 @@
       </w:r>
       <w:r>
         <w:rPr>
-          <w:highlight w:val="none"/>
           <w:lang w:val="ru-RU"/>
         </w:rPr>
       </w:r>
@@ -1030,6 +1021,7 @@
       </w:r>
       <w:r>
         <w:rPr>
+          <w:highlight w:val="none"/>
           <w:lang w:val="ru-RU"/>
         </w:rPr>
       </w:r>
@@ -1089,7 +1081,6 @@
       </w:r>
       <w:r>
         <w:rPr>
-          <w:highlight w:val="none"/>
           <w:lang w:val="ru-RU"/>
         </w:rPr>
       </w:r>
@@ -1119,7 +1110,6 @@
       </w:r>
       <w:r>
         <w:rPr>
-          <w:highlight w:val="none"/>
           <w:lang w:val="ru-RU"/>
         </w:rPr>
       </w:r>
@@ -1149,7 +1139,6 @@
       </w:r>
       <w:r>
         <w:rPr>
-          <w:highlight w:val="none"/>
           <w:lang w:val="ru-RU"/>
         </w:rPr>
       </w:r>
@@ -1187,6 +1176,7 @@
       </w:r>
       <w:r>
         <w:rPr>
+          <w:highlight w:val="none"/>
           <w:lang w:val="ru-RU"/>
         </w:rPr>
       </w:r>
@@ -1333,6 +1323,11 @@
           <w:lang w:val="ru-RU"/>
         </w:rPr>
       </w:r>
+      <w:r>
+        <w:rPr>
+          <w:lang w:val="ru-RU"/>
+        </w:rPr>
+      </w:r>
     </w:p>
     <w:p>
       <w:pPr>
@@ -1354,7 +1349,6 @@
       </w:r>
       <w:r>
         <w:rPr>
-          <w:highlight w:val="none"/>
           <w:lang w:val="ru-RU"/>
         </w:rPr>
       </w:r>
@@ -1496,7 +1490,6 @@
       </w:r>
       <w:r>
         <w:rPr>
-          <w:highlight w:val="none"/>
           <w:lang w:val="ru-RU"/>
         </w:rPr>
       </w:r>
@@ -1669,16 +1662,96 @@
           <w:highlight w:val="none"/>
           <w:lang w:val="ru-RU"/>
         </w:rPr>
-        <w:t xml:space="preserve"> проверки и описания библиотеки.</w:t>
-      </w:r>
-      <w:r>
-        <w:rPr>
-          <w:highlight w:val="none"/>
-          <w:lang w:val="ru-RU"/>
-        </w:rPr>
-      </w:r>
-      <w:r>
-        <w:rPr>
+        <w:t xml:space="preserve"> проверки и описания библиотеки</w:t>
+      </w:r>
+      <w:r>
+        <w:rPr>
+          <w:highlight w:val="none"/>
+          <w:lang w:val="ru-RU"/>
+        </w:rPr>
+        <w:t xml:space="preserve">$</w:t>
+      </w:r>
+      <w:r>
+        <w:rPr>
+          <w:lang w:val="ru-RU"/>
+        </w:rPr>
+      </w:r>
+      <w:r>
+        <w:rPr>
+          <w:lang w:val="ru-RU"/>
+        </w:rPr>
+      </w:r>
+    </w:p>
+    <w:p>
+      <w:pPr>
+        <w:pStyle w:val="847"/>
+        <w:numPr>
+          <w:ilvl w:val="0"/>
+          <w:numId w:val="2"/>
+        </w:numPr>
+        <w:rPr>
+          <w:lang w:val="ru-RU"/>
+        </w:rPr>
+      </w:pPr>
+      <w:r>
+        <w:rPr>
+          <w:highlight w:val="none"/>
+          <w:lang w:val="ru-RU"/>
+        </w:rPr>
+        <w:t xml:space="preserve">для выделенного сервиса бизнес-логики самого расчёта изолированы все выбрасываемые исключения: их результат выводится в выходной объект – для стабильности работы вне зависимости от реализации будущих провайдеров. Поэтому для библиотеки также требуется вести логи экстренных событий, чтобы не потерять значимую информацию. Сама библиотека не должна быть перенасыщенной, поэтому провайдер логгирования будет поставляться </w:t>
+      </w:r>
+      <w:r>
+        <w:rPr>
+          <w:highlight w:val="none"/>
+          <w:lang w:val="ru-RU"/>
+        </w:rPr>
+        <w:t xml:space="preserve">W</w:t>
+      </w:r>
+      <w:r>
+        <w:rPr>
+          <w:highlight w:val="none"/>
+          <w:lang w:val="ru-RU"/>
+        </w:rPr>
+        <w:t xml:space="preserve">e</w:t>
+      </w:r>
+      <w:r>
+        <w:rPr>
+          <w:highlight w:val="none"/>
+          <w:lang w:val="ru-RU"/>
+        </w:rPr>
+        <w:t xml:space="preserve">b</w:t>
+      </w:r>
+      <w:r>
+        <w:rPr>
+          <w:highlight w:val="none"/>
+          <w:lang w:val="ru-RU"/>
+        </w:rPr>
+        <w:t xml:space="preserve"> </w:t>
+      </w:r>
+      <w:r>
+        <w:rPr>
+          <w:highlight w:val="none"/>
+          <w:lang w:val="ru-RU"/>
+        </w:rPr>
+        <w:t xml:space="preserve">A</w:t>
+      </w:r>
+      <w:r>
+        <w:rPr>
+          <w:highlight w:val="none"/>
+          <w:lang w:val="ru-RU"/>
+        </w:rPr>
+        <w:t xml:space="preserve">P</w:t>
+      </w:r>
+      <w:r>
+        <w:rPr>
+          <w:highlight w:val="none"/>
+          <w:lang w:val="ru-RU"/>
+        </w:rPr>
+        <w:t xml:space="preserve">I или другим вызывающим кодом, если это нужно вызывающему коду.</w:t>
+      </w:r>
+      <w:r>
+        <w:rPr>
+          <w:highlight w:val="none"/>
           <w:lang w:val="ru-RU"/>
         </w:rPr>
       </w:r>
@@ -1731,7 +1804,6 @@
       </w:r>
       <w:r>
         <w:rPr>
-          <w:highlight w:val="none"/>
           <w:lang w:val="ru-RU"/>
         </w:rPr>
       </w:r>
@@ -1761,7 +1833,6 @@
       </w:r>
       <w:r>
         <w:rPr>
-          <w:highlight w:val="none"/>
           <w:lang w:val="ru-RU"/>
         </w:rPr>
       </w:r>
@@ -1868,7 +1939,6 @@
       </w:r>
       <w:r>
         <w:rPr>
-          <w:highlight w:val="none"/>
           <w:lang w:val="ru-RU"/>
         </w:rPr>
       </w:r>
@@ -1892,7 +1962,6 @@
       </w:r>
       <w:r>
         <w:rPr>
-          <w:highlight w:val="none"/>
           <w:lang w:val="ru-RU"/>
         </w:rPr>
       </w:r>
@@ -1916,7 +1985,6 @@
       </w:r>
       <w:r>
         <w:rPr>
-          <w:highlight w:val="none"/>
           <w:lang w:val="ru-RU"/>
         </w:rPr>
       </w:r>

</xml_diff>

<commit_message>
Logs improvements (trace, logic)
</commit_message>
<xml_diff>
--- a/documentation/Architecture.docx
+++ b/documentation/Architecture.docx
@@ -1698,7 +1698,14 @@
           <w:highlight w:val="none"/>
           <w:lang w:val="ru-RU"/>
         </w:rPr>
-        <w:t xml:space="preserve">для выделенного сервиса бизнес-логики самого расчёта изолированы все выбрасываемые исключения: их результат выводится в выходной объект – для стабильности работы вне зависимости от реализации будущих провайдеров. Поэтому для библиотеки также требуется вести логи экстренных событий, чтобы не потерять значимую информацию. Сама библиотека не должна быть перенасыщенной, поэтому провайдер логгирования будет поставляться </w:t>
+        <w:t xml:space="preserve">для выделенного сервиса бизнес-логики самого расчёта изолированы все выбрасываемые исключения: их результат выводится в выходной объект – для стабильности работы в</w:t>
+      </w:r>
+      <w:r>
+        <w:rPr>
+          <w:highlight w:val="none"/>
+          <w:lang w:val="ru-RU"/>
+        </w:rPr>
+        <w:t xml:space="preserve">не зависимости от реализации будущих провайдеров. Поэтому для библиотеки также требуется вести логи экстренных событий, чтобы не потерять значимую информацию. Сама библиотека не должна быть перенасыщенной, поэтому провайдер логгирования будет поставляться </w:t>
       </w:r>
       <w:r>
         <w:rPr>
@@ -1752,6 +1759,11 @@
       <w:r>
         <w:rPr>
           <w:highlight w:val="none"/>
+          <w:lang w:val="ru-RU"/>
+        </w:rPr>
+      </w:r>
+      <w:r>
+        <w:rPr>
           <w:lang w:val="ru-RU"/>
         </w:rPr>
       </w:r>
@@ -1951,6 +1963,7 @@
     <w:p>
       <w:pPr>
         <w:rPr>
+          <w:highlight w:val="none"/>
           <w:lang w:val="ru-RU"/>
         </w:rPr>
       </w:pPr>
@@ -1964,15 +1977,22 @@
         <w:rPr>
           <w:lang w:val="ru-RU"/>
         </w:rPr>
-      </w:r>
-      <w:r>
-        <w:rPr>
+        <w:t xml:space="preserve">Дальнейший путь на развитие проекта:</w:t>
+      </w:r>
+      <w:r>
+        <w:rPr>
+          <w:highlight w:val="none"/>
           <w:lang w:val="ru-RU"/>
         </w:rPr>
       </w:r>
     </w:p>
     <w:p>
       <w:pPr>
+        <w:pStyle w:val="847"/>
+        <w:numPr>
+          <w:ilvl w:val="0"/>
+          <w:numId w:val="7"/>
+        </w:numPr>
         <w:rPr>
           <w:lang w:val="ru-RU"/>
         </w:rPr>
@@ -1982,14 +2002,221 @@
           <w:highlight w:val="none"/>
           <w:lang w:val="ru-RU"/>
         </w:rPr>
-      </w:r>
-      <w:r>
-        <w:rPr>
-          <w:lang w:val="ru-RU"/>
-        </w:rPr>
-      </w:r>
-      <w:r>
-        <w:rPr>
+        <w:t xml:space="preserve">реализация расчёта расстояния с учётом поиска пути (или иной вариант, который нужен бизнесу)</w:t>
+      </w:r>
+      <w:r>
+        <w:rPr>
+          <w:highlight w:val="none"/>
+          <w:lang w:val="ru-RU"/>
+        </w:rPr>
+      </w:r>
+    </w:p>
+    <w:p>
+      <w:pPr>
+        <w:pStyle w:val="847"/>
+        <w:numPr>
+          <w:ilvl w:val="0"/>
+          <w:numId w:val="7"/>
+        </w:numPr>
+        <w:rPr>
+          <w:lang w:val="ru-RU"/>
+        </w:rPr>
+      </w:pPr>
+      <w:r>
+        <w:rPr>
+          <w:highlight w:val="none"/>
+          <w:lang w:val="ru-RU"/>
+        </w:rPr>
+      </w:r>
+      <w:r>
+        <w:rPr>
+          <w:highlight w:val="none"/>
+          <w:lang w:val="ru-RU"/>
+        </w:rPr>
+        <w:t xml:space="preserve">перевод логов на LoggerMessage/source-generated logging;</w:t>
+      </w:r>
+      <w:r>
+        <w:rPr>
+          <w:highlight w:val="none"/>
+          <w:lang w:val="ru-RU"/>
+        </w:rPr>
+      </w:r>
+      <w:r>
+        <w:rPr>
+          <w:highlight w:val="none"/>
+          <w:lang w:val="ru-RU"/>
+        </w:rPr>
+      </w:r>
+    </w:p>
+    <w:p>
+      <w:pPr>
+        <w:pStyle w:val="847"/>
+        <w:numPr>
+          <w:ilvl w:val="0"/>
+          <w:numId w:val="7"/>
+        </w:numPr>
+        <w:rPr>
+          <w:lang w:val="ru-RU"/>
+        </w:rPr>
+      </w:pPr>
+      <w:r>
+        <w:rPr>
+          <w:highlight w:val="none"/>
+          <w:lang w:val="ru-RU"/>
+        </w:rPr>
+      </w:r>
+      <w:r>
+        <w:rPr>
+          <w:highlight w:val="none"/>
+          <w:lang w:val="ru-RU"/>
+        </w:rPr>
+        <w:t xml:space="preserve">JSON-логи;</w:t>
+      </w:r>
+      <w:r>
+        <w:rPr>
+          <w:highlight w:val="none"/>
+          <w:lang w:val="ru-RU"/>
+        </w:rPr>
+      </w:r>
+      <w:r>
+        <w:rPr>
+          <w:highlight w:val="none"/>
+          <w:lang w:val="ru-RU"/>
+        </w:rPr>
+      </w:r>
+    </w:p>
+    <w:p>
+      <w:pPr>
+        <w:pStyle w:val="847"/>
+        <w:numPr>
+          <w:ilvl w:val="0"/>
+          <w:numId w:val="7"/>
+        </w:numPr>
+        <w:rPr>
+          <w:lang w:val="ru-RU"/>
+        </w:rPr>
+      </w:pPr>
+      <w:r>
+        <w:rPr>
+          <w:highlight w:val="none"/>
+          <w:lang w:val="ru-RU"/>
+        </w:rPr>
+      </w:r>
+      <w:r>
+        <w:rPr>
+          <w:highlight w:val="none"/>
+          <w:lang w:val="ru-RU"/>
+        </w:rPr>
+        <w:t xml:space="preserve">health checks для мониторинга;</w:t>
+      </w:r>
+      <w:r>
+        <w:rPr>
+          <w:highlight w:val="none"/>
+          <w:lang w:val="ru-RU"/>
+        </w:rPr>
+      </w:r>
+      <w:r>
+        <w:rPr>
+          <w:highlight w:val="none"/>
+          <w:lang w:val="ru-RU"/>
+        </w:rPr>
+      </w:r>
+    </w:p>
+    <w:p>
+      <w:pPr>
+        <w:pStyle w:val="847"/>
+        <w:numPr>
+          <w:ilvl w:val="0"/>
+          <w:numId w:val="7"/>
+        </w:numPr>
+        <w:rPr>
+          <w:lang w:val="ru-RU"/>
+        </w:rPr>
+      </w:pPr>
+      <w:r>
+        <w:rPr>
+          <w:highlight w:val="none"/>
+          <w:lang w:val="ru-RU"/>
+        </w:rPr>
+      </w:r>
+      <w:r>
+        <w:rPr>
+          <w:highlight w:val="none"/>
+          <w:lang w:val="ru-RU"/>
+        </w:rPr>
+        <w:t xml:space="preserve">Prometheus/OpenTelemetry;</w:t>
+      </w:r>
+      <w:r>
+        <w:rPr>
+          <w:highlight w:val="none"/>
+          <w:lang w:val="ru-RU"/>
+        </w:rPr>
+      </w:r>
+      <w:r>
+        <w:rPr>
+          <w:highlight w:val="none"/>
+          <w:lang w:val="ru-RU"/>
+        </w:rPr>
+      </w:r>
+    </w:p>
+    <w:p>
+      <w:pPr>
+        <w:pStyle w:val="847"/>
+        <w:numPr>
+          <w:ilvl w:val="0"/>
+          <w:numId w:val="7"/>
+        </w:numPr>
+        <w:rPr>
+          <w:lang w:val="ru-RU"/>
+        </w:rPr>
+      </w:pPr>
+      <w:r>
+        <w:rPr>
+          <w:highlight w:val="none"/>
+          <w:lang w:val="ru-RU"/>
+        </w:rPr>
+      </w:r>
+      <w:r>
+        <w:rPr>
+          <w:highlight w:val="none"/>
+          <w:lang w:val="ru-RU"/>
+        </w:rPr>
+        <w:t xml:space="preserve">полноценные integration tests с WebApplicationFactory;</w:t>
+      </w:r>
+      <w:r>
+        <w:rPr>
+          <w:highlight w:val="none"/>
+          <w:lang w:val="ru-RU"/>
+        </w:rPr>
+      </w:r>
+      <w:r>
+        <w:rPr>
+          <w:highlight w:val="none"/>
+          <w:lang w:val="ru-RU"/>
+        </w:rPr>
+      </w:r>
+    </w:p>
+    <w:p>
+      <w:pPr>
+        <w:pStyle w:val="847"/>
+        <w:numPr>
+          <w:ilvl w:val="0"/>
+          <w:numId w:val="7"/>
+        </w:numPr>
+        <w:rPr>
+          <w:lang w:val="ru-RU"/>
+        </w:rPr>
+      </w:pPr>
+      <w:r>
+        <w:rPr>
+          <w:highlight w:val="none"/>
+          <w:lang w:val="ru-RU"/>
+        </w:rPr>
+        <w:t xml:space="preserve">контейнеризация</w:t>
+      </w:r>
+      <w:r>
+        <w:rPr>
+          <w:highlight w:val="none"/>
           <w:lang w:val="ru-RU"/>
         </w:rPr>
       </w:r>
@@ -2837,6 +3064,135 @@
       </w:rPr>
     </w:lvl>
   </w:abstractNum>
+  <w:abstractNum w:abstractNumId="6">
+    <w:multiLevelType w:val="hybridMultilevel"/>
+    <w:lvl w:ilvl="0">
+      <w:start w:val="1"/>
+      <w:numFmt w:val="bullet"/>
+      <w:isLgl w:val="false"/>
+      <w:suff w:val="tab"/>
+      <w:lvlText w:val="·"/>
+      <w:lvlJc w:val="left"/>
+      <w:pPr>
+        <w:ind w:left="709" w:hanging="360"/>
+      </w:pPr>
+      <w:rPr>
+        <w:rFonts w:hint="default" w:ascii="Symbol" w:hAnsi="Symbol" w:eastAsia="Symbol" w:cs="Symbol"/>
+      </w:rPr>
+    </w:lvl>
+    <w:lvl w:ilvl="1">
+      <w:start w:val="1"/>
+      <w:numFmt w:val="bullet"/>
+      <w:isLgl w:val="false"/>
+      <w:suff w:val="tab"/>
+      <w:lvlText w:val="o"/>
+      <w:lvlJc w:val="left"/>
+      <w:pPr>
+        <w:ind w:left="1429" w:hanging="360"/>
+      </w:pPr>
+      <w:rPr>
+        <w:rFonts w:hint="default" w:ascii="Courier New" w:hAnsi="Courier New" w:eastAsia="Courier New" w:cs="Courier New"/>
+      </w:rPr>
+    </w:lvl>
+    <w:lvl w:ilvl="2">
+      <w:start w:val="1"/>
+      <w:numFmt w:val="bullet"/>
+      <w:isLgl w:val="false"/>
+      <w:suff w:val="tab"/>
+      <w:lvlText w:val="§"/>
+      <w:lvlJc w:val="left"/>
+      <w:pPr>
+        <w:ind w:left="2149" w:hanging="360"/>
+      </w:pPr>
+      <w:rPr>
+        <w:rFonts w:hint="default" w:ascii="Wingdings" w:hAnsi="Wingdings" w:eastAsia="Wingdings" w:cs="Wingdings"/>
+      </w:rPr>
+    </w:lvl>
+    <w:lvl w:ilvl="3">
+      <w:start w:val="1"/>
+      <w:numFmt w:val="bullet"/>
+      <w:isLgl w:val="false"/>
+      <w:suff w:val="tab"/>
+      <w:lvlText w:val="·"/>
+      <w:lvlJc w:val="left"/>
+      <w:pPr>
+        <w:ind w:left="2869" w:hanging="360"/>
+      </w:pPr>
+      <w:rPr>
+        <w:rFonts w:hint="default" w:ascii="Symbol" w:hAnsi="Symbol" w:eastAsia="Symbol" w:cs="Symbol"/>
+      </w:rPr>
+    </w:lvl>
+    <w:lvl w:ilvl="4">
+      <w:start w:val="1"/>
+      <w:numFmt w:val="bullet"/>
+      <w:isLgl w:val="false"/>
+      <w:suff w:val="tab"/>
+      <w:lvlText w:val="o"/>
+      <w:lvlJc w:val="left"/>
+      <w:pPr>
+        <w:ind w:left="3589" w:hanging="360"/>
+      </w:pPr>
+      <w:rPr>
+        <w:rFonts w:hint="default" w:ascii="Courier New" w:hAnsi="Courier New" w:eastAsia="Courier New" w:cs="Courier New"/>
+      </w:rPr>
+    </w:lvl>
+    <w:lvl w:ilvl="5">
+      <w:start w:val="1"/>
+      <w:numFmt w:val="bullet"/>
+      <w:isLgl w:val="false"/>
+      <w:suff w:val="tab"/>
+      <w:lvlText w:val="§"/>
+      <w:lvlJc w:val="left"/>
+      <w:pPr>
+        <w:ind w:left="4309" w:hanging="360"/>
+      </w:pPr>
+      <w:rPr>
+        <w:rFonts w:hint="default" w:ascii="Wingdings" w:hAnsi="Wingdings" w:eastAsia="Wingdings" w:cs="Wingdings"/>
+      </w:rPr>
+    </w:lvl>
+    <w:lvl w:ilvl="6">
+      <w:start w:val="1"/>
+      <w:numFmt w:val="bullet"/>
+      <w:isLgl w:val="false"/>
+      <w:suff w:val="tab"/>
+      <w:lvlText w:val="·"/>
+      <w:lvlJc w:val="left"/>
+      <w:pPr>
+        <w:ind w:left="5029" w:hanging="360"/>
+      </w:pPr>
+      <w:rPr>
+        <w:rFonts w:hint="default" w:ascii="Symbol" w:hAnsi="Symbol" w:eastAsia="Symbol" w:cs="Symbol"/>
+      </w:rPr>
+    </w:lvl>
+    <w:lvl w:ilvl="7">
+      <w:start w:val="1"/>
+      <w:numFmt w:val="bullet"/>
+      <w:isLgl w:val="false"/>
+      <w:suff w:val="tab"/>
+      <w:lvlText w:val="o"/>
+      <w:lvlJc w:val="left"/>
+      <w:pPr>
+        <w:ind w:left="5749" w:hanging="360"/>
+      </w:pPr>
+      <w:rPr>
+        <w:rFonts w:hint="default" w:ascii="Courier New" w:hAnsi="Courier New" w:eastAsia="Courier New" w:cs="Courier New"/>
+      </w:rPr>
+    </w:lvl>
+    <w:lvl w:ilvl="8">
+      <w:start w:val="1"/>
+      <w:numFmt w:val="bullet"/>
+      <w:isLgl w:val="false"/>
+      <w:suff w:val="tab"/>
+      <w:lvlText w:val="§"/>
+      <w:lvlJc w:val="left"/>
+      <w:pPr>
+        <w:ind w:left="6469" w:hanging="360"/>
+      </w:pPr>
+      <w:rPr>
+        <w:rFonts w:hint="default" w:ascii="Wingdings" w:hAnsi="Wingdings" w:eastAsia="Wingdings" w:cs="Wingdings"/>
+      </w:rPr>
+    </w:lvl>
+  </w:abstractNum>
   <w:num w:numId="1">
     <w:abstractNumId w:val="0"/>
   </w:num>
@@ -2854,6 +3210,9 @@
   </w:num>
   <w:num w:numId="6">
     <w:abstractNumId w:val="5"/>
+  </w:num>
+  <w:num w:numId="7">
+    <w:abstractNumId w:val="6"/>
   </w:num>
 </w:numbering>
 </file>

</xml_diff>